<commit_message>
ajout saé prototype radar de recul
</commit_message>
<xml_diff>
--- a/test_des_seuils_de_detection_sae_prototype_de_radar_de_recul.docx
+++ b/test_des_seuils_de_detection_sae_prototype_de_radar_de_recul.docx
@@ -128,13 +128,7 @@
               <w:rPr>
                 <w:rFonts w:ascii="Cambria Math" w:hAnsi="Cambria Math"/>
               </w:rPr>
-              <m:t>seuil</m:t>
-            </m:r>
-            <m:r>
-              <w:rPr>
-                <w:rFonts w:ascii="Cambria Math" w:hAnsi="Cambria Math"/>
-              </w:rPr>
-              <m:t xml:space="preserve"> 2</m:t>
+              <m:t>seuil 2</m:t>
             </m:r>
           </m:sub>
         </m:sSub>
@@ -142,13 +136,7 @@
           <w:rPr>
             <w:rFonts w:ascii="Cambria Math" w:hAnsi="Cambria Math"/>
           </w:rPr>
-          <m:t>=</m:t>
-        </m:r>
-        <m:r>
-          <w:rPr>
-            <w:rFonts w:ascii="Cambria Math" w:hAnsi="Cambria Math"/>
-          </w:rPr>
-          <m:t>7,5</m:t>
+          <m:t>=7,5</m:t>
         </m:r>
       </m:oMath>
       <w:r>
@@ -188,13 +176,7 @@
               <w:rPr>
                 <w:rFonts w:ascii="Cambria Math" w:hAnsi="Cambria Math"/>
               </w:rPr>
-              <m:t>seuil</m:t>
-            </m:r>
-            <m:r>
-              <w:rPr>
-                <w:rFonts w:ascii="Cambria Math" w:hAnsi="Cambria Math"/>
-              </w:rPr>
-              <m:t xml:space="preserve"> 3</m:t>
+              <m:t>seuil 3</m:t>
             </m:r>
           </m:sub>
         </m:sSub>
@@ -202,33 +184,691 @@
           <w:rPr>
             <w:rFonts w:ascii="Cambria Math" w:hAnsi="Cambria Math"/>
           </w:rPr>
-          <m:t>=</m:t>
+          <m:t>=11,25</m:t>
         </m:r>
+      </m:oMath>
+      <w:r>
+        <w:rPr>
+          <w:rFonts w:eastAsiaTheme="minorEastAsia"/>
+        </w:rPr>
+        <w:t xml:space="preserve"> V</w:t>
+      </w:r>
+    </w:p>
+    <w:p>
+      <w:pPr>
+        <w:pStyle w:val="Paragraphedeliste"/>
+        <w:rPr>
+          <w:rFonts w:eastAsiaTheme="minorEastAsia"/>
+        </w:rPr>
+      </w:pPr>
+    </w:p>
+    <w:p>
+      <w:pPr>
+        <w:pStyle w:val="Paragraphedeliste"/>
+        <w:numPr>
+          <w:ilvl w:val="0"/>
+          <w:numId w:val="1"/>
+        </w:numPr>
+        <w:rPr>
+          <w:b/>
+          <w:bCs/>
+        </w:rPr>
+      </w:pPr>
+      <w:r>
+        <w:rPr>
+          <w:b/>
+          <w:bCs/>
+        </w:rPr>
+        <w:t xml:space="preserve">Comportement des </w:t>
+      </w:r>
+      <w:proofErr w:type="spellStart"/>
+      <w:r>
+        <w:rPr>
+          <w:b/>
+          <w:bCs/>
+        </w:rPr>
+        <w:t>LEDs</w:t>
+      </w:r>
+      <w:proofErr w:type="spellEnd"/>
+    </w:p>
+    <w:p>
+      <w:pPr>
+        <w:pStyle w:val="Paragraphedeliste"/>
+        <w:numPr>
+          <w:ilvl w:val="0"/>
+          <w:numId w:val="2"/>
+        </w:numPr>
+      </w:pPr>
+      <w:r>
+        <w:t>LED verte</w:t>
+      </w:r>
+      <w:r>
+        <w:t> : allumée si la tension est supérieure ou égale au seuil 1.</w:t>
+      </w:r>
+    </w:p>
+    <w:p>
+      <w:pPr>
+        <w:pStyle w:val="Paragraphedeliste"/>
+        <w:numPr>
+          <w:ilvl w:val="0"/>
+          <w:numId w:val="2"/>
+        </w:numPr>
+      </w:pPr>
+      <w:r>
+        <w:t xml:space="preserve">LED </w:t>
+      </w:r>
+      <w:r>
+        <w:t>orange : allumée si la tension est supérieure ou égale au seuil 2.</w:t>
+      </w:r>
+    </w:p>
+    <w:p>
+      <w:pPr>
+        <w:pStyle w:val="Paragraphedeliste"/>
+        <w:numPr>
+          <w:ilvl w:val="0"/>
+          <w:numId w:val="2"/>
+        </w:numPr>
+      </w:pPr>
+      <w:r>
+        <w:t xml:space="preserve">LED </w:t>
+      </w:r>
+      <w:r>
+        <w:t>rouge : allumée si la tension est supérieure ou égale au seuil 3.</w:t>
+      </w:r>
+    </w:p>
+    <w:p>
+      <w:pPr>
+        <w:pStyle w:val="Paragraphedeliste"/>
+        <w:ind w:left="1080"/>
+      </w:pPr>
+    </w:p>
+    <w:p>
+      <w:pPr>
+        <w:pStyle w:val="Paragraphedeliste"/>
+        <w:numPr>
+          <w:ilvl w:val="0"/>
+          <w:numId w:val="1"/>
+        </w:numPr>
+        <w:rPr>
+          <w:b/>
+          <w:bCs/>
+        </w:rPr>
+      </w:pPr>
+      <w:r>
+        <w:rPr>
+          <w:b/>
+          <w:bCs/>
+        </w:rPr>
+        <w:t xml:space="preserve">Illustration de l’allumage des </w:t>
+      </w:r>
+      <w:proofErr w:type="spellStart"/>
+      <w:r>
+        <w:rPr>
+          <w:b/>
+          <w:bCs/>
+        </w:rPr>
+        <w:t>LEDs</w:t>
+      </w:r>
+      <w:proofErr w:type="spellEnd"/>
+      <w:r>
+        <w:rPr>
+          <w:b/>
+          <w:bCs/>
+        </w:rPr>
+        <w:t xml:space="preserve"> en fonction de la tension</w:t>
+      </w:r>
+    </w:p>
+    <w:p>
+      <w:pPr>
+        <w:pStyle w:val="Paragraphedeliste"/>
+        <w:rPr>
+          <w:b/>
+          <w:bCs/>
+        </w:rPr>
+      </w:pPr>
+    </w:p>
+    <w:p>
+      <w:pPr>
+        <w:pStyle w:val="Paragraphedeliste"/>
+        <w:jc w:val="center"/>
+      </w:pPr>
+      <w:r>
+        <w:rPr>
+          <w:b/>
+          <w:bCs/>
+          <w:noProof/>
+        </w:rPr>
+        <w:drawing>
+          <wp:inline distT="0" distB="0" distL="0" distR="0" wp14:anchorId="35FC371B" wp14:editId="18BA5829">
+            <wp:extent cx="5387735" cy="4040802"/>
+            <wp:effectExtent l="6667" t="0" r="0" b="0"/>
+            <wp:docPr id="1610609057" name="Image 6" descr="Une image contenant fils électriques, câble, Appareils électroniques, Ingénierie électronique&#10;&#10;Le contenu généré par l’IA peut être incorrect."/>
+            <wp:cNvGraphicFramePr>
+              <a:graphicFrameLocks xmlns:a="http://schemas.openxmlformats.org/drawingml/2006/main" noChangeAspect="1"/>
+            </wp:cNvGraphicFramePr>
+            <a:graphic xmlns:a="http://schemas.openxmlformats.org/drawingml/2006/main">
+              <a:graphicData uri="http://schemas.openxmlformats.org/drawingml/2006/picture">
+                <pic:pic xmlns:pic="http://schemas.openxmlformats.org/drawingml/2006/picture">
+                  <pic:nvPicPr>
+                    <pic:cNvPr id="1610609057" name="Image 6" descr="Une image contenant fils électriques, câble, Appareils électroniques, Ingénierie électronique&#10;&#10;Le contenu généré par l’IA peut être incorrect."/>
+                    <pic:cNvPicPr/>
+                  </pic:nvPicPr>
+                  <pic:blipFill>
+                    <a:blip r:embed="rId5" cstate="print">
+                      <a:extLst>
+                        <a:ext uri="{28A0092B-C50C-407E-A947-70E740481C1C}">
+                          <a14:useLocalDpi xmlns:a14="http://schemas.microsoft.com/office/drawing/2010/main" val="0"/>
+                        </a:ext>
+                      </a:extLst>
+                    </a:blip>
+                    <a:stretch>
+                      <a:fillRect/>
+                    </a:stretch>
+                  </pic:blipFill>
+                  <pic:spPr>
+                    <a:xfrm rot="5400000">
+                      <a:off x="0" y="0"/>
+                      <a:ext cx="5406056" cy="4054543"/>
+                    </a:xfrm>
+                    <a:prstGeom prst="rect">
+                      <a:avLst/>
+                    </a:prstGeom>
+                  </pic:spPr>
+                </pic:pic>
+              </a:graphicData>
+            </a:graphic>
+          </wp:inline>
+        </w:drawing>
+      </w:r>
+    </w:p>
+    <w:p>
+      <w:pPr>
+        <w:pStyle w:val="Paragraphedeliste"/>
+        <w:jc w:val="center"/>
+      </w:pPr>
+      <w:proofErr w:type="spellStart"/>
+      <w:r>
+        <w:t>LEDs</w:t>
+      </w:r>
+      <w:proofErr w:type="spellEnd"/>
+      <w:r>
+        <w:t xml:space="preserve"> éteintes à </w:t>
+      </w:r>
+      <m:oMath>
+        <m:r>
+          <w:rPr>
+            <w:rFonts w:ascii="Cambria Math" w:hAnsi="Cambria Math"/>
+          </w:rPr>
+          <m:t>3,1</m:t>
+        </m:r>
+        <m:r>
+          <w:rPr>
+            <w:rFonts w:ascii="Cambria Math" w:hAnsi="Cambria Math"/>
+          </w:rPr>
+          <m:t>8</m:t>
+        </m:r>
+      </m:oMath>
+      <w:r>
+        <w:t xml:space="preserve"> </w:t>
+      </w:r>
+      <w:r>
+        <w:t>V</w:t>
+      </w:r>
+      <w:r>
+        <w:t>.</w:t>
+      </w:r>
+    </w:p>
+    <w:p>
+      <w:pPr>
+        <w:pStyle w:val="Paragraphedeliste"/>
+        <w:jc w:val="center"/>
+      </w:pPr>
+      <w:r>
+        <w:rPr>
+          <w:noProof/>
+        </w:rPr>
+        <w:lastRenderedPageBreak/>
+        <w:drawing>
+          <wp:inline distT="0" distB="0" distL="0" distR="0" wp14:anchorId="179E020D" wp14:editId="3CF4DC75">
+            <wp:extent cx="5488538" cy="4116404"/>
+            <wp:effectExtent l="318" t="0" r="0" b="0"/>
+            <wp:docPr id="2125929350" name="Image 5" descr="Une image contenant câble, fils électriques, Ingénierie électronique, Appareils électroniques&#10;&#10;Le contenu généré par l’IA peut être incorrect."/>
+            <wp:cNvGraphicFramePr>
+              <a:graphicFrameLocks xmlns:a="http://schemas.openxmlformats.org/drawingml/2006/main" noChangeAspect="1"/>
+            </wp:cNvGraphicFramePr>
+            <a:graphic xmlns:a="http://schemas.openxmlformats.org/drawingml/2006/main">
+              <a:graphicData uri="http://schemas.openxmlformats.org/drawingml/2006/picture">
+                <pic:pic xmlns:pic="http://schemas.openxmlformats.org/drawingml/2006/picture">
+                  <pic:nvPicPr>
+                    <pic:cNvPr id="2125929350" name="Image 5" descr="Une image contenant câble, fils électriques, Ingénierie électronique, Appareils électroniques&#10;&#10;Le contenu généré par l’IA peut être incorrect."/>
+                    <pic:cNvPicPr/>
+                  </pic:nvPicPr>
+                  <pic:blipFill>
+                    <a:blip r:embed="rId6" cstate="print">
+                      <a:extLst>
+                        <a:ext uri="{28A0092B-C50C-407E-A947-70E740481C1C}">
+                          <a14:useLocalDpi xmlns:a14="http://schemas.microsoft.com/office/drawing/2010/main" val="0"/>
+                        </a:ext>
+                      </a:extLst>
+                    </a:blip>
+                    <a:stretch>
+                      <a:fillRect/>
+                    </a:stretch>
+                  </pic:blipFill>
+                  <pic:spPr>
+                    <a:xfrm rot="5400000">
+                      <a:off x="0" y="0"/>
+                      <a:ext cx="5532170" cy="4149128"/>
+                    </a:xfrm>
+                    <a:prstGeom prst="rect">
+                      <a:avLst/>
+                    </a:prstGeom>
+                  </pic:spPr>
+                </pic:pic>
+              </a:graphicData>
+            </a:graphic>
+          </wp:inline>
+        </w:drawing>
+      </w:r>
+    </w:p>
+    <w:p>
+      <w:pPr>
+        <w:pStyle w:val="Paragraphedeliste"/>
+        <w:jc w:val="center"/>
+      </w:pPr>
+      <w:r>
+        <w:t>LED verte allumée</w:t>
+      </w:r>
+      <w:r>
+        <w:t xml:space="preserve"> à partir de </w:t>
+      </w:r>
+      <m:oMath>
+        <m:r>
+          <w:rPr>
+            <w:rFonts w:ascii="Cambria Math" w:hAnsi="Cambria Math"/>
+          </w:rPr>
+          <m:t>≈3,19</m:t>
+        </m:r>
+      </m:oMath>
+      <w:r>
+        <w:t xml:space="preserve"> V.</w:t>
+      </w:r>
+    </w:p>
+    <w:p>
+      <w:pPr>
+        <w:pStyle w:val="Paragraphedeliste"/>
+        <w:jc w:val="center"/>
+        <w:rPr>
+          <w:b/>
+          <w:bCs/>
+        </w:rPr>
+      </w:pPr>
+      <w:r>
+        <w:rPr>
+          <w:noProof/>
+        </w:rPr>
+        <w:lastRenderedPageBreak/>
+        <w:drawing>
+          <wp:inline distT="0" distB="0" distL="0" distR="0" wp14:anchorId="64F17FD9" wp14:editId="3B7CC741">
+            <wp:extent cx="5475105" cy="4106329"/>
+            <wp:effectExtent l="0" t="1270" r="0" b="0"/>
+            <wp:docPr id="560994665" name="Image 4" descr="Une image contenant Appareils électroniques, câble, fils électriques, Ingénierie électronique&#10;&#10;Le contenu généré par l’IA peut être incorrect."/>
+            <wp:cNvGraphicFramePr>
+              <a:graphicFrameLocks xmlns:a="http://schemas.openxmlformats.org/drawingml/2006/main" noChangeAspect="1"/>
+            </wp:cNvGraphicFramePr>
+            <a:graphic xmlns:a="http://schemas.openxmlformats.org/drawingml/2006/main">
+              <a:graphicData uri="http://schemas.openxmlformats.org/drawingml/2006/picture">
+                <pic:pic xmlns:pic="http://schemas.openxmlformats.org/drawingml/2006/picture">
+                  <pic:nvPicPr>
+                    <pic:cNvPr id="560994665" name="Image 4" descr="Une image contenant Appareils électroniques, câble, fils électriques, Ingénierie électronique&#10;&#10;Le contenu généré par l’IA peut être incorrect."/>
+                    <pic:cNvPicPr/>
+                  </pic:nvPicPr>
+                  <pic:blipFill>
+                    <a:blip r:embed="rId7" cstate="print">
+                      <a:extLst>
+                        <a:ext uri="{28A0092B-C50C-407E-A947-70E740481C1C}">
+                          <a14:useLocalDpi xmlns:a14="http://schemas.microsoft.com/office/drawing/2010/main" val="0"/>
+                        </a:ext>
+                      </a:extLst>
+                    </a:blip>
+                    <a:stretch>
+                      <a:fillRect/>
+                    </a:stretch>
+                  </pic:blipFill>
+                  <pic:spPr>
+                    <a:xfrm rot="5400000">
+                      <a:off x="0" y="0"/>
+                      <a:ext cx="5496260" cy="4122196"/>
+                    </a:xfrm>
+                    <a:prstGeom prst="rect">
+                      <a:avLst/>
+                    </a:prstGeom>
+                  </pic:spPr>
+                </pic:pic>
+              </a:graphicData>
+            </a:graphic>
+          </wp:inline>
+        </w:drawing>
+      </w:r>
+    </w:p>
+    <w:p>
+      <w:pPr>
+        <w:pStyle w:val="Paragraphedeliste"/>
+        <w:jc w:val="center"/>
+      </w:pPr>
+      <w:r>
+        <w:t xml:space="preserve">Uniquement </w:t>
+      </w:r>
+      <w:r>
+        <w:t>LED verte</w:t>
+      </w:r>
+      <w:r>
+        <w:t xml:space="preserve"> </w:t>
+      </w:r>
+      <w:r>
+        <w:t xml:space="preserve">allumée à </w:t>
+      </w:r>
+      <m:oMath>
+        <m:r>
+          <w:rPr>
+            <w:rFonts w:ascii="Cambria Math" w:hAnsi="Cambria Math"/>
+          </w:rPr>
+          <m:t>7,38</m:t>
+        </m:r>
+      </m:oMath>
+      <w:r>
+        <w:t xml:space="preserve"> V.</w:t>
+      </w:r>
+    </w:p>
+    <w:p>
+      <w:pPr>
+        <w:pStyle w:val="Paragraphedeliste"/>
+        <w:jc w:val="center"/>
+        <w:rPr>
+          <w:b/>
+          <w:bCs/>
+        </w:rPr>
+      </w:pPr>
+      <w:r>
+        <w:rPr>
+          <w:noProof/>
+        </w:rPr>
+        <w:lastRenderedPageBreak/>
+        <w:drawing>
+          <wp:inline distT="0" distB="0" distL="0" distR="0" wp14:anchorId="571A8F09" wp14:editId="2EFD0385">
+            <wp:extent cx="5576446" cy="4182334"/>
+            <wp:effectExtent l="0" t="7937" r="0" b="0"/>
+            <wp:docPr id="540586372" name="Image 3" descr="Une image contenant Appareils électroniques, fils électriques, câble, Ingénierie électronique&#10;&#10;Le contenu généré par l’IA peut être incorrect."/>
+            <wp:cNvGraphicFramePr>
+              <a:graphicFrameLocks xmlns:a="http://schemas.openxmlformats.org/drawingml/2006/main" noChangeAspect="1"/>
+            </wp:cNvGraphicFramePr>
+            <a:graphic xmlns:a="http://schemas.openxmlformats.org/drawingml/2006/main">
+              <a:graphicData uri="http://schemas.openxmlformats.org/drawingml/2006/picture">
+                <pic:pic xmlns:pic="http://schemas.openxmlformats.org/drawingml/2006/picture">
+                  <pic:nvPicPr>
+                    <pic:cNvPr id="540586372" name="Image 3" descr="Une image contenant Appareils électroniques, fils électriques, câble, Ingénierie électronique&#10;&#10;Le contenu généré par l’IA peut être incorrect."/>
+                    <pic:cNvPicPr/>
+                  </pic:nvPicPr>
+                  <pic:blipFill>
+                    <a:blip r:embed="rId8" cstate="print">
+                      <a:extLst>
+                        <a:ext uri="{28A0092B-C50C-407E-A947-70E740481C1C}">
+                          <a14:useLocalDpi xmlns:a14="http://schemas.microsoft.com/office/drawing/2010/main" val="0"/>
+                        </a:ext>
+                      </a:extLst>
+                    </a:blip>
+                    <a:stretch>
+                      <a:fillRect/>
+                    </a:stretch>
+                  </pic:blipFill>
+                  <pic:spPr>
+                    <a:xfrm rot="5400000">
+                      <a:off x="0" y="0"/>
+                      <a:ext cx="5595994" cy="4196995"/>
+                    </a:xfrm>
+                    <a:prstGeom prst="rect">
+                      <a:avLst/>
+                    </a:prstGeom>
+                  </pic:spPr>
+                </pic:pic>
+              </a:graphicData>
+            </a:graphic>
+          </wp:inline>
+        </w:drawing>
+      </w:r>
+    </w:p>
+    <w:p>
+      <w:pPr>
+        <w:pStyle w:val="Paragraphedeliste"/>
+        <w:jc w:val="center"/>
+      </w:pPr>
+      <w:proofErr w:type="spellStart"/>
+      <w:r>
+        <w:t>LED</w:t>
+      </w:r>
+      <w:r>
+        <w:t>s</w:t>
+      </w:r>
+      <w:proofErr w:type="spellEnd"/>
+      <w:r>
+        <w:t xml:space="preserve"> verte</w:t>
+      </w:r>
+      <w:r>
+        <w:t xml:space="preserve"> et orange</w:t>
+      </w:r>
+      <w:r>
+        <w:t xml:space="preserve"> allumée</w:t>
+      </w:r>
+      <w:r>
+        <w:t>s</w:t>
+      </w:r>
+      <w:r>
+        <w:t xml:space="preserve"> à partir de </w:t>
+      </w:r>
+      <m:oMath>
+        <m:r>
+          <w:rPr>
+            <w:rFonts w:ascii="Cambria Math" w:hAnsi="Cambria Math"/>
+          </w:rPr>
+          <m:t>≈</m:t>
+        </m:r>
+        <m:r>
+          <w:rPr>
+            <w:rFonts w:ascii="Cambria Math" w:hAnsi="Cambria Math"/>
+          </w:rPr>
+          <m:t>7,39</m:t>
+        </m:r>
+      </m:oMath>
+      <w:r>
+        <w:t xml:space="preserve"> V.</w:t>
+      </w:r>
+    </w:p>
+    <w:p>
+      <w:pPr>
+        <w:pStyle w:val="Paragraphedeliste"/>
+        <w:jc w:val="center"/>
+        <w:rPr>
+          <w:b/>
+          <w:bCs/>
+        </w:rPr>
+      </w:pPr>
+      <w:r>
+        <w:rPr>
+          <w:b/>
+          <w:bCs/>
+          <w:noProof/>
+        </w:rPr>
+        <w:lastRenderedPageBreak/>
+        <w:drawing>
+          <wp:inline distT="0" distB="0" distL="0" distR="0" wp14:anchorId="2295837F" wp14:editId="7E519F4E">
+            <wp:extent cx="5536764" cy="4152574"/>
+            <wp:effectExtent l="6350" t="0" r="0" b="0"/>
+            <wp:docPr id="1531714808" name="Image 1" descr="Une image contenant Appareils électroniques, câble, texte, fils électriques&#10;&#10;Le contenu généré par l’IA peut être incorrect."/>
+            <wp:cNvGraphicFramePr>
+              <a:graphicFrameLocks xmlns:a="http://schemas.openxmlformats.org/drawingml/2006/main" noChangeAspect="1"/>
+            </wp:cNvGraphicFramePr>
+            <a:graphic xmlns:a="http://schemas.openxmlformats.org/drawingml/2006/main">
+              <a:graphicData uri="http://schemas.openxmlformats.org/drawingml/2006/picture">
+                <pic:pic xmlns:pic="http://schemas.openxmlformats.org/drawingml/2006/picture">
+                  <pic:nvPicPr>
+                    <pic:cNvPr id="1531714808" name="Image 1" descr="Une image contenant Appareils électroniques, câble, texte, fils électriques&#10;&#10;Le contenu généré par l’IA peut être incorrect."/>
+                    <pic:cNvPicPr/>
+                  </pic:nvPicPr>
+                  <pic:blipFill>
+                    <a:blip r:embed="rId9" cstate="print">
+                      <a:extLst>
+                        <a:ext uri="{28A0092B-C50C-407E-A947-70E740481C1C}">
+                          <a14:useLocalDpi xmlns:a14="http://schemas.microsoft.com/office/drawing/2010/main" val="0"/>
+                        </a:ext>
+                      </a:extLst>
+                    </a:blip>
+                    <a:stretch>
+                      <a:fillRect/>
+                    </a:stretch>
+                  </pic:blipFill>
+                  <pic:spPr>
+                    <a:xfrm rot="5400000">
+                      <a:off x="0" y="0"/>
+                      <a:ext cx="5553361" cy="4165022"/>
+                    </a:xfrm>
+                    <a:prstGeom prst="rect">
+                      <a:avLst/>
+                    </a:prstGeom>
+                  </pic:spPr>
+                </pic:pic>
+              </a:graphicData>
+            </a:graphic>
+          </wp:inline>
+        </w:drawing>
+      </w:r>
+    </w:p>
+    <w:p>
+      <w:pPr>
+        <w:pStyle w:val="Paragraphedeliste"/>
+        <w:jc w:val="center"/>
+      </w:pPr>
+      <w:r>
+        <w:t xml:space="preserve">Uniquement </w:t>
+      </w:r>
+      <w:proofErr w:type="spellStart"/>
+      <w:r>
+        <w:t>LEDs</w:t>
+      </w:r>
+      <w:proofErr w:type="spellEnd"/>
+      <w:r>
+        <w:t xml:space="preserve"> verte et orange allumées à </w:t>
+      </w:r>
+      <m:oMath>
         <m:r>
           <w:rPr>
             <w:rFonts w:ascii="Cambria Math" w:hAnsi="Cambria Math"/>
           </w:rPr>
           <m:t>11</m:t>
         </m:r>
+      </m:oMath>
+      <w:r>
+        <w:t xml:space="preserve"> V.</w:t>
+      </w:r>
+    </w:p>
+    <w:p>
+      <w:pPr>
+        <w:pStyle w:val="Paragraphedeliste"/>
+        <w:jc w:val="center"/>
+        <w:rPr>
+          <w:b/>
+          <w:bCs/>
+        </w:rPr>
+      </w:pPr>
+      <w:r>
+        <w:rPr>
+          <w:noProof/>
+        </w:rPr>
+        <w:lastRenderedPageBreak/>
+        <w:drawing>
+          <wp:inline distT="0" distB="0" distL="0" distR="0" wp14:anchorId="3D66981B" wp14:editId="23E616AE">
+            <wp:extent cx="5547515" cy="4160638"/>
+            <wp:effectExtent l="7620" t="0" r="3810" b="3810"/>
+            <wp:docPr id="876769525" name="Image 2" descr="Une image contenant câble, fils électriques, Appareils électroniques, Ingénierie électronique&#10;&#10;Le contenu généré par l’IA peut être incorrect."/>
+            <wp:cNvGraphicFramePr>
+              <a:graphicFrameLocks xmlns:a="http://schemas.openxmlformats.org/drawingml/2006/main" noChangeAspect="1"/>
+            </wp:cNvGraphicFramePr>
+            <a:graphic xmlns:a="http://schemas.openxmlformats.org/drawingml/2006/main">
+              <a:graphicData uri="http://schemas.openxmlformats.org/drawingml/2006/picture">
+                <pic:pic xmlns:pic="http://schemas.openxmlformats.org/drawingml/2006/picture">
+                  <pic:nvPicPr>
+                    <pic:cNvPr id="876769525" name="Image 2" descr="Une image contenant câble, fils électriques, Appareils électroniques, Ingénierie électronique&#10;&#10;Le contenu généré par l’IA peut être incorrect."/>
+                    <pic:cNvPicPr/>
+                  </pic:nvPicPr>
+                  <pic:blipFill>
+                    <a:blip r:embed="rId10" cstate="print">
+                      <a:extLst>
+                        <a:ext uri="{28A0092B-C50C-407E-A947-70E740481C1C}">
+                          <a14:useLocalDpi xmlns:a14="http://schemas.microsoft.com/office/drawing/2010/main" val="0"/>
+                        </a:ext>
+                      </a:extLst>
+                    </a:blip>
+                    <a:stretch>
+                      <a:fillRect/>
+                    </a:stretch>
+                  </pic:blipFill>
+                  <pic:spPr>
+                    <a:xfrm rot="5400000">
+                      <a:off x="0" y="0"/>
+                      <a:ext cx="5590734" cy="4193052"/>
+                    </a:xfrm>
+                    <a:prstGeom prst="rect">
+                      <a:avLst/>
+                    </a:prstGeom>
+                  </pic:spPr>
+                </pic:pic>
+              </a:graphicData>
+            </a:graphic>
+          </wp:inline>
+        </w:drawing>
+      </w:r>
+    </w:p>
+    <w:p>
+      <w:pPr>
+        <w:pStyle w:val="Paragraphedeliste"/>
+        <w:jc w:val="center"/>
+      </w:pPr>
+      <w:proofErr w:type="spellStart"/>
+      <w:r>
+        <w:t>LEDs</w:t>
+      </w:r>
+      <w:proofErr w:type="spellEnd"/>
+      <w:r>
+        <w:t xml:space="preserve"> verte</w:t>
+      </w:r>
+      <w:r>
+        <w:t>,</w:t>
+      </w:r>
+      <w:r>
+        <w:t xml:space="preserve"> orange </w:t>
+      </w:r>
+      <w:r>
+        <w:t xml:space="preserve">et rouge </w:t>
+      </w:r>
+      <w:r>
+        <w:t xml:space="preserve">allumées à partir de </w:t>
+      </w:r>
+      <m:oMath>
         <m:r>
           <w:rPr>
             <w:rFonts w:ascii="Cambria Math" w:hAnsi="Cambria Math"/>
           </w:rPr>
-          <m:t>,25</m:t>
+          <m:t>11,15</m:t>
         </m:r>
       </m:oMath>
       <w:r>
-        <w:rPr>
-          <w:rFonts w:eastAsiaTheme="minorEastAsia"/>
-        </w:rPr>
-        <w:t xml:space="preserve"> V</w:t>
-      </w:r>
-    </w:p>
-    <w:p>
-      <w:pPr>
-        <w:pStyle w:val="Paragraphedeliste"/>
-        <w:rPr>
-          <w:rFonts w:eastAsiaTheme="minorEastAsia"/>
+        <w:t xml:space="preserve"> V.</w:t>
+      </w:r>
+    </w:p>
+    <w:p>
+      <w:pPr>
+        <w:rPr>
+          <w:b/>
+          <w:bCs/>
         </w:rPr>
       </w:pPr>
     </w:p>
@@ -249,123 +889,358 @@
           <w:b/>
           <w:bCs/>
         </w:rPr>
-        <w:t xml:space="preserve">Comportement des </w:t>
-      </w:r>
-      <w:proofErr w:type="spellStart"/>
-      <w:r>
+        <w:t>Relevés de distances</w:t>
+      </w:r>
+    </w:p>
+    <w:p>
+      <w:pPr>
+        <w:pStyle w:val="Paragraphedeliste"/>
         <w:rPr>
           <w:b/>
           <w:bCs/>
         </w:rPr>
-        <w:t>LEDs</w:t>
-      </w:r>
-      <w:proofErr w:type="spellEnd"/>
-    </w:p>
-    <w:p>
-      <w:pPr>
-        <w:pStyle w:val="Paragraphedeliste"/>
-        <w:numPr>
-          <w:ilvl w:val="0"/>
-          <w:numId w:val="2"/>
-        </w:numPr>
-      </w:pPr>
-      <w:r>
-        <w:t>LED verte</w:t>
-      </w:r>
-      <w:r>
-        <w:t> : allumée si la tension est supérieure ou égale au seuil 1.</w:t>
-      </w:r>
-    </w:p>
-    <w:p>
-      <w:pPr>
-        <w:pStyle w:val="Paragraphedeliste"/>
-        <w:numPr>
-          <w:ilvl w:val="0"/>
-          <w:numId w:val="2"/>
-        </w:numPr>
-      </w:pPr>
-      <w:r>
-        <w:t xml:space="preserve">LED </w:t>
-      </w:r>
-      <w:r>
-        <w:t>orange</w:t>
-      </w:r>
-      <w:r>
-        <w:t xml:space="preserve"> : allumée si la tension est supérieure ou égale au seuil </w:t>
-      </w:r>
-      <w:r>
-        <w:t>2</w:t>
-      </w:r>
-      <w:r>
-        <w:t>.</w:t>
-      </w:r>
-    </w:p>
-    <w:p>
-      <w:pPr>
-        <w:pStyle w:val="Paragraphedeliste"/>
-        <w:numPr>
-          <w:ilvl w:val="0"/>
-          <w:numId w:val="2"/>
-        </w:numPr>
-      </w:pPr>
-      <w:r>
-        <w:t xml:space="preserve">LED </w:t>
-      </w:r>
-      <w:r>
-        <w:t>rouge</w:t>
-      </w:r>
-      <w:r>
-        <w:t xml:space="preserve"> : allumée si la tension est supérieure ou égale au seuil </w:t>
-      </w:r>
-      <w:r>
-        <w:t>3</w:t>
-      </w:r>
-      <w:r>
-        <w:t>.</w:t>
-      </w:r>
-    </w:p>
-    <w:p>
-      <w:pPr>
-        <w:pStyle w:val="Paragraphedeliste"/>
-        <w:ind w:left="1080"/>
-      </w:pPr>
-    </w:p>
-    <w:p>
-      <w:pPr>
-        <w:pStyle w:val="Paragraphedeliste"/>
-        <w:numPr>
-          <w:ilvl w:val="0"/>
-          <w:numId w:val="1"/>
-        </w:numPr>
-        <w:rPr>
-          <w:b/>
-          <w:bCs/>
-        </w:rPr>
-      </w:pPr>
-      <w:r>
-        <w:rPr>
-          <w:b/>
-          <w:bCs/>
-        </w:rPr>
-        <w:t xml:space="preserve">Illustration de l’allumage des </w:t>
-      </w:r>
-      <w:proofErr w:type="spellStart"/>
-      <w:r>
-        <w:rPr>
-          <w:b/>
-          <w:bCs/>
-        </w:rPr>
-        <w:t>LEDs</w:t>
-      </w:r>
-      <w:proofErr w:type="spellEnd"/>
-      <w:r>
-        <w:rPr>
-          <w:b/>
-          <w:bCs/>
-        </w:rPr>
-        <w:t xml:space="preserve"> en fonction de la tension</w:t>
-      </w:r>
-    </w:p>
+      </w:pPr>
+    </w:p>
+    <w:tbl>
+      <w:tblPr>
+        <w:tblStyle w:val="Grilledutableau"/>
+        <w:tblW w:w="8489" w:type="dxa"/>
+        <w:tblInd w:w="720" w:type="dxa"/>
+        <w:tblLook w:val="04A0" w:firstRow="1" w:lastRow="0" w:firstColumn="1" w:lastColumn="0" w:noHBand="0" w:noVBand="1"/>
+      </w:tblPr>
+      <w:tblGrid>
+        <w:gridCol w:w="2113"/>
+        <w:gridCol w:w="2125"/>
+        <w:gridCol w:w="2125"/>
+        <w:gridCol w:w="2126"/>
+      </w:tblGrid>
+      <w:tr>
+        <w:tc>
+          <w:tcPr>
+            <w:tcW w:w="1243" w:type="pct"/>
+          </w:tcPr>
+          <w:p>
+            <w:pPr>
+              <w:pStyle w:val="Paragraphedeliste"/>
+              <w:ind w:left="0"/>
+              <w:jc w:val="center"/>
+            </w:pPr>
+            <w:r>
+              <w:t>Distance de l'obstacle (d)</w:t>
+            </w:r>
+          </w:p>
+        </w:tc>
+        <w:tc>
+          <w:tcPr>
+            <w:tcW w:w="1250" w:type="pct"/>
+          </w:tcPr>
+          <w:p>
+            <w:pPr>
+              <w:pStyle w:val="Paragraphedeliste"/>
+              <w:ind w:left="0"/>
+              <w:jc w:val="center"/>
+            </w:pPr>
+            <w:r>
+              <w:t>État LED Verte</w:t>
+            </w:r>
+          </w:p>
+        </w:tc>
+        <w:tc>
+          <w:tcPr>
+            <w:tcW w:w="1250" w:type="pct"/>
+          </w:tcPr>
+          <w:p>
+            <w:pPr>
+              <w:pStyle w:val="Paragraphedeliste"/>
+              <w:ind w:left="0"/>
+              <w:jc w:val="center"/>
+            </w:pPr>
+            <w:r>
+              <w:t>État LED Orange</w:t>
+            </w:r>
+          </w:p>
+        </w:tc>
+        <w:tc>
+          <w:tcPr>
+            <w:tcW w:w="1250" w:type="pct"/>
+          </w:tcPr>
+          <w:p>
+            <w:pPr>
+              <w:pStyle w:val="Paragraphedeliste"/>
+              <w:ind w:left="0"/>
+              <w:jc w:val="center"/>
+            </w:pPr>
+            <w:r>
+              <w:t>État LED Rouge</w:t>
+            </w:r>
+          </w:p>
+        </w:tc>
+      </w:tr>
+      <w:tr>
+        <w:tc>
+          <w:tcPr>
+            <w:tcW w:w="1243" w:type="pct"/>
+          </w:tcPr>
+          <w:p>
+            <w:pPr>
+              <w:pStyle w:val="Paragraphedeliste"/>
+              <w:ind w:left="0"/>
+              <w:jc w:val="center"/>
+            </w:pPr>
+            <w:proofErr w:type="gramStart"/>
+            <w:r>
+              <w:t>d</w:t>
+            </w:r>
+            <w:proofErr w:type="gramEnd"/>
+            <w:r>
+              <w:t xml:space="preserve"> &gt; </w:t>
+            </w:r>
+            <w:r>
+              <w:t>5</w:t>
+            </w:r>
+            <w:r>
+              <w:t>0 cm</w:t>
+            </w:r>
+          </w:p>
+        </w:tc>
+        <w:tc>
+          <w:tcPr>
+            <w:tcW w:w="1250" w:type="pct"/>
+          </w:tcPr>
+          <w:p>
+            <w:pPr>
+              <w:pStyle w:val="Paragraphedeliste"/>
+              <w:ind w:left="0"/>
+              <w:jc w:val="center"/>
+            </w:pPr>
+            <w:r>
+              <w:t>Éteinte</w:t>
+            </w:r>
+          </w:p>
+        </w:tc>
+        <w:tc>
+          <w:tcPr>
+            <w:tcW w:w="1250" w:type="pct"/>
+          </w:tcPr>
+          <w:p>
+            <w:pPr>
+              <w:pStyle w:val="Paragraphedeliste"/>
+              <w:ind w:left="0"/>
+              <w:jc w:val="center"/>
+            </w:pPr>
+            <w:r>
+              <w:t>Éteinte</w:t>
+            </w:r>
+          </w:p>
+        </w:tc>
+        <w:tc>
+          <w:tcPr>
+            <w:tcW w:w="1250" w:type="pct"/>
+          </w:tcPr>
+          <w:p>
+            <w:pPr>
+              <w:pStyle w:val="Paragraphedeliste"/>
+              <w:ind w:left="0"/>
+              <w:jc w:val="center"/>
+            </w:pPr>
+            <w:r>
+              <w:t>Éteinte</w:t>
+            </w:r>
+          </w:p>
+        </w:tc>
+      </w:tr>
+      <w:tr>
+        <w:tc>
+          <w:tcPr>
+            <w:tcW w:w="1243" w:type="pct"/>
+          </w:tcPr>
+          <w:p>
+            <w:pPr>
+              <w:pStyle w:val="Paragraphedeliste"/>
+              <w:ind w:left="0"/>
+              <w:jc w:val="center"/>
+            </w:pPr>
+            <w:r>
+              <w:t>50 cm &gt; d &gt; 25 cm</w:t>
+            </w:r>
+          </w:p>
+        </w:tc>
+        <w:tc>
+          <w:tcPr>
+            <w:tcW w:w="1250" w:type="pct"/>
+          </w:tcPr>
+          <w:p>
+            <w:pPr>
+              <w:pStyle w:val="Paragraphedeliste"/>
+              <w:ind w:left="0"/>
+              <w:jc w:val="center"/>
+            </w:pPr>
+            <w:r>
+              <w:t>Allumée</w:t>
+            </w:r>
+          </w:p>
+        </w:tc>
+        <w:tc>
+          <w:tcPr>
+            <w:tcW w:w="1250" w:type="pct"/>
+          </w:tcPr>
+          <w:p>
+            <w:pPr>
+              <w:pStyle w:val="Paragraphedeliste"/>
+              <w:ind w:left="0"/>
+              <w:jc w:val="center"/>
+            </w:pPr>
+            <w:r>
+              <w:t>Éteinte</w:t>
+            </w:r>
+          </w:p>
+        </w:tc>
+        <w:tc>
+          <w:tcPr>
+            <w:tcW w:w="1250" w:type="pct"/>
+          </w:tcPr>
+          <w:p>
+            <w:pPr>
+              <w:pStyle w:val="Paragraphedeliste"/>
+              <w:ind w:left="0"/>
+              <w:jc w:val="center"/>
+            </w:pPr>
+            <w:r>
+              <w:t>Éteinte</w:t>
+            </w:r>
+          </w:p>
+        </w:tc>
+      </w:tr>
+      <w:tr>
+        <w:tc>
+          <w:tcPr>
+            <w:tcW w:w="1243" w:type="pct"/>
+          </w:tcPr>
+          <w:p>
+            <w:pPr>
+              <w:pStyle w:val="Paragraphedeliste"/>
+              <w:ind w:left="0"/>
+              <w:jc w:val="center"/>
+            </w:pPr>
+            <w:r>
+              <w:t>25 cm &gt; d &gt; 15 cm</w:t>
+            </w:r>
+          </w:p>
+        </w:tc>
+        <w:tc>
+          <w:tcPr>
+            <w:tcW w:w="1250" w:type="pct"/>
+          </w:tcPr>
+          <w:p>
+            <w:pPr>
+              <w:pStyle w:val="Paragraphedeliste"/>
+              <w:ind w:left="0"/>
+              <w:jc w:val="center"/>
+            </w:pPr>
+            <w:r>
+              <w:t>Allumée</w:t>
+            </w:r>
+          </w:p>
+        </w:tc>
+        <w:tc>
+          <w:tcPr>
+            <w:tcW w:w="1250" w:type="pct"/>
+          </w:tcPr>
+          <w:p>
+            <w:pPr>
+              <w:pStyle w:val="Paragraphedeliste"/>
+              <w:ind w:left="0"/>
+              <w:jc w:val="center"/>
+            </w:pPr>
+            <w:r>
+              <w:t>Allumée</w:t>
+            </w:r>
+          </w:p>
+        </w:tc>
+        <w:tc>
+          <w:tcPr>
+            <w:tcW w:w="1250" w:type="pct"/>
+          </w:tcPr>
+          <w:p>
+            <w:pPr>
+              <w:pStyle w:val="Paragraphedeliste"/>
+              <w:ind w:left="0"/>
+              <w:jc w:val="center"/>
+            </w:pPr>
+            <w:r>
+              <w:t>Éteinte</w:t>
+            </w:r>
+          </w:p>
+        </w:tc>
+      </w:tr>
+      <w:tr>
+        <w:tc>
+          <w:tcPr>
+            <w:tcW w:w="1243" w:type="pct"/>
+          </w:tcPr>
+          <w:p>
+            <w:pPr>
+              <w:pStyle w:val="Paragraphedeliste"/>
+              <w:ind w:left="0"/>
+              <w:jc w:val="center"/>
+            </w:pPr>
+            <w:proofErr w:type="gramStart"/>
+            <w:r>
+              <w:t>d</w:t>
+            </w:r>
+            <w:proofErr w:type="gramEnd"/>
+            <w:r>
+              <w:t xml:space="preserve"> &lt; 15 cm</w:t>
+            </w:r>
+          </w:p>
+        </w:tc>
+        <w:tc>
+          <w:tcPr>
+            <w:tcW w:w="1250" w:type="pct"/>
+          </w:tcPr>
+          <w:p>
+            <w:pPr>
+              <w:pStyle w:val="Paragraphedeliste"/>
+              <w:ind w:left="0"/>
+              <w:jc w:val="center"/>
+            </w:pPr>
+            <w:r>
+              <w:t>Allumée</w:t>
+            </w:r>
+          </w:p>
+        </w:tc>
+        <w:tc>
+          <w:tcPr>
+            <w:tcW w:w="1250" w:type="pct"/>
+          </w:tcPr>
+          <w:p>
+            <w:pPr>
+              <w:pStyle w:val="Paragraphedeliste"/>
+              <w:ind w:left="0"/>
+              <w:jc w:val="center"/>
+            </w:pPr>
+            <w:r>
+              <w:t>Allumée</w:t>
+            </w:r>
+          </w:p>
+        </w:tc>
+        <w:tc>
+          <w:tcPr>
+            <w:tcW w:w="1250" w:type="pct"/>
+          </w:tcPr>
+          <w:p>
+            <w:pPr>
+              <w:pStyle w:val="Paragraphedeliste"/>
+              <w:ind w:left="0"/>
+              <w:jc w:val="center"/>
+            </w:pPr>
+            <w:r>
+              <w:t>Allumée</w:t>
+            </w:r>
+          </w:p>
+        </w:tc>
+      </w:tr>
+    </w:tbl>
     <w:p>
       <w:pPr>
         <w:pStyle w:val="Paragraphedeliste"/>
@@ -1201,7 +2076,6 @@
   <w:style w:type="character" w:default="1" w:styleId="Policepardfaut">
     <w:name w:val="Default Paragraph Font"/>
     <w:uiPriority w:val="1"/>
-    <w:semiHidden/>
     <w:unhideWhenUsed/>
   </w:style>
   <w:style w:type="table" w:default="1" w:styleId="TableauNormal">
@@ -1524,6 +2398,25 @@
     <w:rPr>
       <w:color w:val="666666"/>
     </w:rPr>
+  </w:style>
+  <w:style w:type="table" w:styleId="Grilledutableau">
+    <w:name w:val="Table Grid"/>
+    <w:basedOn w:val="TableauNormal"/>
+    <w:uiPriority w:val="39"/>
+    <w:rsid w:val="007938FF"/>
+    <w:pPr>
+      <w:spacing w:after="0" w:line="240" w:lineRule="auto"/>
+    </w:pPr>
+    <w:tblPr>
+      <w:tblBorders>
+        <w:top w:val="single" w:sz="4" w:space="0" w:color="auto"/>
+        <w:left w:val="single" w:sz="4" w:space="0" w:color="auto"/>
+        <w:bottom w:val="single" w:sz="4" w:space="0" w:color="auto"/>
+        <w:right w:val="single" w:sz="4" w:space="0" w:color="auto"/>
+        <w:insideH w:val="single" w:sz="4" w:space="0" w:color="auto"/>
+        <w:insideV w:val="single" w:sz="4" w:space="0" w:color="auto"/>
+      </w:tblBorders>
+    </w:tblPr>
   </w:style>
 </w:styles>
 </file>

</xml_diff>